<commit_message>
Restore original styling and refresh TSA1 documentation
</commit_message>
<xml_diff>
--- a/submission/IT0049 - TSA1 - Tasks for Today System Documentation.docx
+++ b/submission/IT0049 - TSA1 - Tasks for Today System Documentation.docx
@@ -11,7 +11,7 @@
         <w:rPr>
           <w:rFonts w:ascii="Aptos Mono" w:hAnsi="Aptos Mono"/>
           <w:b/>
-          <w:color w:val="2864DC"/>
+          <w:color w:val="116466"/>
           <w:sz w:val="18"/>
         </w:rPr>
         <w:t>IT0049  WEB SYSTEM TECHNOLOGIES</w:t>
@@ -67,7 +67,7 @@
         <w:tc>
           <w:tcPr>
             <w:tcW w:type="dxa" w:w="2232"/>
-            <w:shd w:fill="101B32"/>
+            <w:shd w:fill="17222B"/>
             <w:tcMar>
               <w:top w:w="120" w:type="dxa"/>
               <w:start w:w="150" w:type="dxa"/>
@@ -94,7 +94,7 @@
         <w:tc>
           <w:tcPr>
             <w:tcW w:type="dxa" w:w="7128"/>
-            <w:shd w:fill="101B32"/>
+            <w:shd w:fill="17222B"/>
             <w:tcMar>
               <w:top w:w="120" w:type="dxa"/>
               <w:start w:w="150" w:type="dxa"/>
@@ -176,7 +176,7 @@
               <w:end w:w="150" w:type="dxa"/>
             </w:tcMar>
             <w:vAlign w:val="center"/>
-            <w:shd w:fill="F5F7FB"/>
+            <w:shd w:fill="F7F5EF"/>
           </w:tcPr>
           <w:p>
             <w:r>
@@ -199,7 +199,7 @@
               <w:end w:w="150" w:type="dxa"/>
             </w:tcMar>
             <w:vAlign w:val="center"/>
-            <w:shd w:fill="F5F7FB"/>
+            <w:shd w:fill="F7F5EF"/>
           </w:tcPr>
           <w:p>
             <w:r>
@@ -270,7 +270,7 @@
               <w:end w:w="150" w:type="dxa"/>
             </w:tcMar>
             <w:vAlign w:val="center"/>
-            <w:shd w:fill="F5F7FB"/>
+            <w:shd w:fill="F7F5EF"/>
           </w:tcPr>
           <w:p>
             <w:r>
@@ -293,7 +293,7 @@
               <w:end w:w="150" w:type="dxa"/>
             </w:tcMar>
             <w:vAlign w:val="center"/>
-            <w:shd w:fill="F5F7FB"/>
+            <w:shd w:fill="F7F5EF"/>
           </w:tcPr>
           <w:p>
             <w:r>
@@ -385,7 +385,7 @@
         <w:rPr>
           <w:rFonts w:ascii="Aptos Mono" w:hAnsi="Aptos Mono"/>
           <w:b/>
-          <w:color w:val="2864DC"/>
+          <w:color w:val="116466"/>
           <w:sz w:val="17"/>
         </w:rPr>
         <w:t>PROJECT RESULT</w:t>
@@ -439,7 +439,7 @@
         <w:tc>
           <w:tcPr>
             <w:tcW w:type="dxa" w:w="1152"/>
-            <w:shd w:fill="101B32"/>
+            <w:shd w:fill="17222B"/>
             <w:tcMar>
               <w:top w:w="120" w:type="dxa"/>
               <w:start w:w="150" w:type="dxa"/>
@@ -466,7 +466,7 @@
         <w:tc>
           <w:tcPr>
             <w:tcW w:type="dxa" w:w="2880"/>
-            <w:shd w:fill="101B32"/>
+            <w:shd w:fill="17222B"/>
             <w:tcMar>
               <w:top w:w="120" w:type="dxa"/>
               <w:start w:w="150" w:type="dxa"/>
@@ -493,7 +493,7 @@
         <w:tc>
           <w:tcPr>
             <w:tcW w:type="dxa" w:w="5328"/>
-            <w:shd w:fill="101B32"/>
+            <w:shd w:fill="17222B"/>
             <w:tcMar>
               <w:top w:w="120" w:type="dxa"/>
               <w:start w:w="150" w:type="dxa"/>
@@ -597,7 +597,7 @@
               <w:end w:w="150" w:type="dxa"/>
             </w:tcMar>
             <w:vAlign w:val="center"/>
-            <w:shd w:fill="F5F7FB"/>
+            <w:shd w:fill="F7F5EF"/>
           </w:tcPr>
           <w:p>
             <w:r>
@@ -620,7 +620,7 @@
               <w:end w:w="150" w:type="dxa"/>
             </w:tcMar>
             <w:vAlign w:val="center"/>
-            <w:shd w:fill="F5F7FB"/>
+            <w:shd w:fill="F7F5EF"/>
           </w:tcPr>
           <w:p>
             <w:r>
@@ -643,7 +643,7 @@
               <w:end w:w="150" w:type="dxa"/>
             </w:tcMar>
             <w:vAlign w:val="center"/>
-            <w:shd w:fill="F5F7FB"/>
+            <w:shd w:fill="F7F5EF"/>
           </w:tcPr>
           <w:p>
             <w:r>
@@ -736,7 +736,7 @@
               <w:end w:w="150" w:type="dxa"/>
             </w:tcMar>
             <w:vAlign w:val="center"/>
-            <w:shd w:fill="F5F7FB"/>
+            <w:shd w:fill="F7F5EF"/>
           </w:tcPr>
           <w:p>
             <w:r>
@@ -759,7 +759,7 @@
               <w:end w:w="150" w:type="dxa"/>
             </w:tcMar>
             <w:vAlign w:val="center"/>
-            <w:shd w:fill="F5F7FB"/>
+            <w:shd w:fill="F7F5EF"/>
           </w:tcPr>
           <w:p>
             <w:r>
@@ -782,7 +782,7 @@
               <w:end w:w="150" w:type="dxa"/>
             </w:tcMar>
             <w:vAlign w:val="center"/>
-            <w:shd w:fill="F5F7FB"/>
+            <w:shd w:fill="F7F5EF"/>
           </w:tcPr>
           <w:p>
             <w:r>
@@ -915,7 +915,7 @@
         <w:tc>
           <w:tcPr>
             <w:tcW w:type="dxa" w:w="1440"/>
-            <w:shd w:fill="101B32"/>
+            <w:shd w:fill="17222B"/>
             <w:tcMar>
               <w:top w:w="120" w:type="dxa"/>
               <w:start w:w="150" w:type="dxa"/>
@@ -942,7 +942,7 @@
         <w:tc>
           <w:tcPr>
             <w:tcW w:type="dxa" w:w="3240"/>
-            <w:shd w:fill="101B32"/>
+            <w:shd w:fill="17222B"/>
             <w:tcMar>
               <w:top w:w="120" w:type="dxa"/>
               <w:start w:w="150" w:type="dxa"/>
@@ -969,7 +969,7 @@
         <w:tc>
           <w:tcPr>
             <w:tcW w:type="dxa" w:w="4680"/>
-            <w:shd w:fill="101B32"/>
+            <w:shd w:fill="17222B"/>
             <w:tcMar>
               <w:top w:w="120" w:type="dxa"/>
               <w:start w:w="150" w:type="dxa"/>
@@ -1073,7 +1073,7 @@
               <w:end w:w="150" w:type="dxa"/>
             </w:tcMar>
             <w:vAlign w:val="center"/>
-            <w:shd w:fill="F5F7FB"/>
+            <w:shd w:fill="F7F5EF"/>
           </w:tcPr>
           <w:p>
             <w:r>
@@ -1096,7 +1096,7 @@
               <w:end w:w="150" w:type="dxa"/>
             </w:tcMar>
             <w:vAlign w:val="center"/>
-            <w:shd w:fill="F5F7FB"/>
+            <w:shd w:fill="F7F5EF"/>
           </w:tcPr>
           <w:p>
             <w:r>
@@ -1119,7 +1119,7 @@
               <w:end w:w="150" w:type="dxa"/>
             </w:tcMar>
             <w:vAlign w:val="center"/>
-            <w:shd w:fill="F5F7FB"/>
+            <w:shd w:fill="F7F5EF"/>
           </w:tcPr>
           <w:p>
             <w:r>
@@ -1212,7 +1212,7 @@
               <w:end w:w="150" w:type="dxa"/>
             </w:tcMar>
             <w:vAlign w:val="center"/>
-            <w:shd w:fill="F5F7FB"/>
+            <w:shd w:fill="F7F5EF"/>
           </w:tcPr>
           <w:p>
             <w:r>
@@ -1235,7 +1235,7 @@
               <w:end w:w="150" w:type="dxa"/>
             </w:tcMar>
             <w:vAlign w:val="center"/>
-            <w:shd w:fill="F5F7FB"/>
+            <w:shd w:fill="F7F5EF"/>
           </w:tcPr>
           <w:p>
             <w:r>
@@ -1258,7 +1258,7 @@
               <w:end w:w="150" w:type="dxa"/>
             </w:tcMar>
             <w:vAlign w:val="center"/>
-            <w:shd w:fill="F5F7FB"/>
+            <w:shd w:fill="F7F5EF"/>
           </w:tcPr>
           <w:p>
             <w:r>
@@ -1354,7 +1354,7 @@
         <w:rPr>
           <w:rFonts w:ascii="Aptos Mono" w:hAnsi="Aptos Mono"/>
           <w:b/>
-          <w:color w:val="2864DC"/>
+          <w:color w:val="116466"/>
           <w:sz w:val="17"/>
         </w:rPr>
         <w:t>LOCAL SETUP</w:t>
@@ -1481,7 +1481,7 @@
       <w:r>
         <w:rPr>
           <w:rFonts w:ascii="Consolas" w:hAnsi="Consolas"/>
-          <w:color w:val="101B32"/>
+          <w:color w:val="17222B"/>
           <w:sz w:val="19"/>
         </w:rPr>
         <w:t>C:\xampp\php\php.exe spark migrate</w:t>
@@ -1495,7 +1495,7 @@
       <w:r>
         <w:rPr>
           <w:rFonts w:ascii="Consolas" w:hAnsi="Consolas"/>
-          <w:color w:val="101B32"/>
+          <w:color w:val="17222B"/>
           <w:sz w:val="19"/>
         </w:rPr>
         <w:t>C:\xampp\php\php.exe spark db:seed TaskSystemSeeder</w:t>
@@ -1535,7 +1535,7 @@
         <w:tc>
           <w:tcPr>
             <w:tcW w:type="dxa" w:w="2376"/>
-            <w:shd w:fill="101B32"/>
+            <w:shd w:fill="17222B"/>
             <w:tcMar>
               <w:top w:w="120" w:type="dxa"/>
               <w:start w:w="150" w:type="dxa"/>
@@ -1562,7 +1562,7 @@
         <w:tc>
           <w:tcPr>
             <w:tcW w:type="dxa" w:w="6984"/>
-            <w:shd w:fill="101B32"/>
+            <w:shd w:fill="17222B"/>
             <w:tcMar>
               <w:top w:w="120" w:type="dxa"/>
               <w:start w:w="150" w:type="dxa"/>
@@ -1644,7 +1644,7 @@
               <w:end w:w="150" w:type="dxa"/>
             </w:tcMar>
             <w:vAlign w:val="center"/>
-            <w:shd w:fill="F5F7FB"/>
+            <w:shd w:fill="F7F5EF"/>
           </w:tcPr>
           <w:p>
             <w:r>
@@ -1667,7 +1667,7 @@
               <w:end w:w="150" w:type="dxa"/>
             </w:tcMar>
             <w:vAlign w:val="center"/>
-            <w:shd w:fill="F5F7FB"/>
+            <w:shd w:fill="F7F5EF"/>
           </w:tcPr>
           <w:p>
             <w:r>
@@ -1738,7 +1738,7 @@
               <w:end w:w="150" w:type="dxa"/>
             </w:tcMar>
             <w:vAlign w:val="center"/>
-            <w:shd w:fill="F5F7FB"/>
+            <w:shd w:fill="F7F5EF"/>
           </w:tcPr>
           <w:p>
             <w:r>
@@ -1761,7 +1761,7 @@
               <w:end w:w="150" w:type="dxa"/>
             </w:tcMar>
             <w:vAlign w:val="center"/>
-            <w:shd w:fill="F5F7FB"/>
+            <w:shd w:fill="F7F5EF"/>
           </w:tcPr>
           <w:p>
             <w:r>
@@ -1853,7 +1853,7 @@
         <w:rPr>
           <w:rFonts w:ascii="Aptos Mono" w:hAnsi="Aptos Mono"/>
           <w:b/>
-          <w:color w:val="2864DC"/>
+          <w:color w:val="116466"/>
           <w:sz w:val="17"/>
         </w:rPr>
         <w:t>WEBSITE EVIDENCE 1</w:t>
@@ -1947,7 +1947,7 @@
         <w:rPr>
           <w:rFonts w:ascii="Aptos Mono" w:hAnsi="Aptos Mono"/>
           <w:b/>
-          <w:color w:val="2864DC"/>
+          <w:color w:val="116466"/>
           <w:sz w:val="17"/>
         </w:rPr>
         <w:t>WEBSITE EVIDENCE 2</w:t>
@@ -2041,7 +2041,7 @@
         <w:rPr>
           <w:rFonts w:ascii="Aptos Mono" w:hAnsi="Aptos Mono"/>
           <w:b/>
-          <w:color w:val="2864DC"/>
+          <w:color w:val="116466"/>
           <w:sz w:val="17"/>
         </w:rPr>
         <w:t>WEBSITE EVIDENCE 3</w:t>
@@ -2076,7 +2076,7 @@
       <w:r>
         <w:drawing>
           <wp:inline xmlns:a="http://schemas.openxmlformats.org/drawingml/2006/main" xmlns:pic="http://schemas.openxmlformats.org/drawingml/2006/picture">
-            <wp:extent cx="5806440" cy="4233862"/>
+            <wp:extent cx="5806440" cy="6048375"/>
             <wp:docPr id="3" name="Picture 3" descr="Figure 3. Profile page showing the single demo user." title="Figure 3. Profile page showing the single demo user."/>
             <wp:cNvGraphicFramePr>
               <a:graphicFrameLocks noChangeAspect="1"/>
@@ -2097,7 +2097,7 @@
                   <pic:spPr>
                     <a:xfrm>
                       <a:off x="0" y="0"/>
-                      <a:ext cx="5806440" cy="4233862"/>
+                      <a:ext cx="5806440" cy="6048375"/>
                     </a:xfrm>
                     <a:prstGeom prst="rect"/>
                   </pic:spPr>
@@ -2177,7 +2177,7 @@
         <w:rPr>
           <w:rFonts w:ascii="Aptos Mono" w:hAnsi="Aptos Mono"/>
           <w:b/>
-          <w:color w:val="2864DC"/>
+          <w:color w:val="116466"/>
           <w:sz w:val="17"/>
         </w:rPr>
         <w:t>WEBSITE EVIDENCE 4</w:t>
@@ -2212,7 +2212,7 @@
       <w:r>
         <w:drawing>
           <wp:inline xmlns:a="http://schemas.openxmlformats.org/drawingml/2006/main" xmlns:pic="http://schemas.openxmlformats.org/drawingml/2006/picture">
-            <wp:extent cx="5806440" cy="4233862"/>
+            <wp:extent cx="5806440" cy="6048375"/>
             <wp:docPr id="4" name="Picture 4" descr="Figure 4. About page and MVC application flow." title="Figure 4. About page and MVC application flow."/>
             <wp:cNvGraphicFramePr>
               <a:graphicFrameLocks noChangeAspect="1"/>
@@ -2233,7 +2233,7 @@
                   <pic:spPr>
                     <a:xfrm>
                       <a:off x="0" y="0"/>
-                      <a:ext cx="5806440" cy="4233862"/>
+                      <a:ext cx="5806440" cy="6048375"/>
                     </a:xfrm>
                     <a:prstGeom prst="rect"/>
                   </pic:spPr>
@@ -2313,7 +2313,7 @@
         <w:rPr>
           <w:rFonts w:ascii="Aptos Mono" w:hAnsi="Aptos Mono"/>
           <w:b/>
-          <w:color w:val="2864DC"/>
+          <w:color w:val="116466"/>
           <w:sz w:val="17"/>
         </w:rPr>
         <w:t>VERIFICATION</w:t>
@@ -2353,7 +2353,7 @@
         <w:tc>
           <w:tcPr>
             <w:tcW w:type="dxa" w:w="2880"/>
-            <w:shd w:fill="101B32"/>
+            <w:shd w:fill="17222B"/>
             <w:tcMar>
               <w:top w:w="120" w:type="dxa"/>
               <w:start w:w="150" w:type="dxa"/>
@@ -2380,7 +2380,7 @@
         <w:tc>
           <w:tcPr>
             <w:tcW w:type="dxa" w:w="6480"/>
-            <w:shd w:fill="101B32"/>
+            <w:shd w:fill="17222B"/>
             <w:tcMar>
               <w:top w:w="120" w:type="dxa"/>
               <w:start w:w="150" w:type="dxa"/>
@@ -2462,7 +2462,7 @@
               <w:end w:w="150" w:type="dxa"/>
             </w:tcMar>
             <w:vAlign w:val="center"/>
-            <w:shd w:fill="F5F7FB"/>
+            <w:shd w:fill="F7F5EF"/>
           </w:tcPr>
           <w:p>
             <w:r>
@@ -2485,7 +2485,7 @@
               <w:end w:w="150" w:type="dxa"/>
             </w:tcMar>
             <w:vAlign w:val="center"/>
-            <w:shd w:fill="F5F7FB"/>
+            <w:shd w:fill="F7F5EF"/>
           </w:tcPr>
           <w:p>
             <w:r>
@@ -2556,7 +2556,7 @@
               <w:end w:w="150" w:type="dxa"/>
             </w:tcMar>
             <w:vAlign w:val="center"/>
-            <w:shd w:fill="F5F7FB"/>
+            <w:shd w:fill="F7F5EF"/>
           </w:tcPr>
           <w:p>
             <w:r>
@@ -2579,7 +2579,7 @@
               <w:end w:w="150" w:type="dxa"/>
             </w:tcMar>
             <w:vAlign w:val="center"/>
-            <w:shd w:fill="F5F7FB"/>
+            <w:shd w:fill="F7F5EF"/>
           </w:tcPr>
           <w:p>
             <w:r>
@@ -2650,7 +2650,7 @@
               <w:end w:w="150" w:type="dxa"/>
             </w:tcMar>
             <w:vAlign w:val="center"/>
-            <w:shd w:fill="F5F7FB"/>
+            <w:shd w:fill="F7F5EF"/>
           </w:tcPr>
           <w:p>
             <w:r>
@@ -2673,7 +2673,7 @@
               <w:end w:w="150" w:type="dxa"/>
             </w:tcMar>
             <w:vAlign w:val="center"/>
-            <w:shd w:fill="F5F7FB"/>
+            <w:shd w:fill="F7F5EF"/>
           </w:tcPr>
           <w:p>
             <w:r>
@@ -2682,7 +2682,7 @@
                 <w:color w:val="000000"/>
                 <w:sz w:val="19"/>
               </w:rPr>
-              <w:t>Navigation, hero, statistics, and task cards adapt at 500 px</w:t>
+              <w:t>Navigation and summary cards adapt at 500 px; task table scrolls horizontally</w:t>
             </w:r>
           </w:p>
         </w:tc>
@@ -2817,7 +2817,7 @@
             <w:r>
               <w:drawing>
                 <wp:inline xmlns:a="http://schemas.openxmlformats.org/drawingml/2006/main" xmlns:pic="http://schemas.openxmlformats.org/drawingml/2006/picture">
-                  <wp:extent cx="2834640" cy="5669280"/>
+                  <wp:extent cx="2057400" cy="6583680"/>
                   <wp:docPr id="5" name="Picture 5" descr="Responsive Today dashboard at a 500 pixel viewport." title="Responsive Today dashboard"/>
                   <wp:cNvGraphicFramePr>
                     <a:graphicFrameLocks noChangeAspect="1"/>
@@ -2838,7 +2838,7 @@
                         <pic:spPr>
                           <a:xfrm>
                             <a:off x="0" y="0"/>
-                            <a:ext cx="2834640" cy="5669280"/>
+                            <a:ext cx="2057400" cy="6583680"/>
                           </a:xfrm>
                           <a:prstGeom prst="rect"/>
                         </pic:spPr>
@@ -2896,7 +2896,7 @@
                 <w:color w:val="000000"/>
                 <w:sz w:val="20"/>
               </w:rPr>
-              <w:t>The date block and dashboard content stack vertically.</w:t>
+              <w:t>The original SimplePOS-style navigation and summary cards stack vertically on narrow screens.</w:t>
             </w:r>
           </w:p>
           <w:p>
@@ -2910,7 +2910,7 @@
                 <w:color w:val="000000"/>
                 <w:sz w:val="20"/>
               </w:rPr>
-              <w:t>Task status badges move below task titles when horizontal space is limited.</w:t>
+              <w:t>The task table remains readable by scrolling horizontally on narrow screens.</w:t>
             </w:r>
           </w:p>
           <w:p>
@@ -2924,7 +2924,7 @@
                 <w:color w:val="000000"/>
                 <w:sz w:val="20"/>
               </w:rPr>
-              <w:t>Keyboard focus is visible and reduced-motion preferences are respected.</w:t>
+              <w:t>Keyboard focus is visible on navigation links and buttons.</w:t>
             </w:r>
           </w:p>
         </w:tc>

</xml_diff>